<commit_message>
20260506: updated updates-qmds files for GMACS updates through 20250505
</commit_message>
<xml_diff>
--- a/updates-qmds/Updates_Tables.docx
+++ b/updates-qmds/Updates_Tables.docx
@@ -10,7 +10,10 @@
         <w:t xml:space="preserve">2025-12 to </w:t>
       </w:r>
       <w:r>
-        <w:t>2026-04</w:t>
+        <w:t>2026-0</w:t>
+      </w:r>
+      <w:r>
+        <w:t>5</w:t>
       </w:r>
     </w:p>
     <w:p>
@@ -28,6 +31,14 @@
     </w:p>
     <w:p>
       <w:r>
+        <w:t>UpdateTables_A.pdf</w:t>
+      </w:r>
+    </w:p>
+    <w:p>
+      <w:r>
+        <w:rPr>
+          <w:noProof/>
+        </w:rPr>
         <w:drawing>
           <wp:inline distT="0" distB="0" distL="0" distR="0" wp14:anchorId="71EBE0EF" wp14:editId="1F9C1EC9">
             <wp:extent cx="5943600" cy="4691380"/>
@@ -65,15 +76,24 @@
         </w:drawing>
       </w:r>
     </w:p>
-    <w:p/>
+    <w:p>
+      <w:r>
+        <w:br w:type="page"/>
+      </w:r>
+    </w:p>
     <w:p>
       <w:r>
         <w:lastRenderedPageBreak/>
+        <w:t>UpdateTables_B.pdf</w:t>
+      </w:r>
+    </w:p>
+    <w:p>
+      <w:r>
         <w:drawing>
-          <wp:inline distT="0" distB="0" distL="0" distR="0" wp14:anchorId="58C92BAE" wp14:editId="750E6728">
-            <wp:extent cx="5943600" cy="4782185"/>
-            <wp:effectExtent l="0" t="0" r="0" b="5715"/>
-            <wp:docPr id="1245989815" name="Picture 1"/>
+          <wp:inline distT="0" distB="0" distL="0" distR="0" wp14:anchorId="1CD5CC5D" wp14:editId="4FE9A338">
+            <wp:extent cx="5943600" cy="5657850"/>
+            <wp:effectExtent l="0" t="0" r="0" b="6350"/>
+            <wp:docPr id="1591711171" name="Picture 1"/>
             <wp:cNvGraphicFramePr>
               <a:graphicFrameLocks xmlns:a="http://schemas.openxmlformats.org/drawingml/2006/main" noChangeAspect="1"/>
             </wp:cNvGraphicFramePr>
@@ -81,7 +101,7 @@
               <a:graphicData uri="http://schemas.openxmlformats.org/drawingml/2006/picture">
                 <pic:pic xmlns:pic="http://schemas.openxmlformats.org/drawingml/2006/picture">
                   <pic:nvPicPr>
-                    <pic:cNvPr id="1245989815" name=""/>
+                    <pic:cNvPr id="1591711171" name=""/>
                     <pic:cNvPicPr/>
                   </pic:nvPicPr>
                   <pic:blipFill>
@@ -93,7 +113,7 @@
                   <pic:spPr>
                     <a:xfrm>
                       <a:off x="0" y="0"/>
-                      <a:ext cx="5943600" cy="4782185"/>
+                      <a:ext cx="5943600" cy="5657850"/>
                     </a:xfrm>
                     <a:prstGeom prst="rect">
                       <a:avLst/>

</xml_diff>

<commit_message>
20260507. Changed Derived_quatities to Derived_quantities in gmacs.rep1 file. Updated Updates_Tables files.
</commit_message>
<xml_diff>
--- a/updates-qmds/Updates_Tables.docx
+++ b/updates-qmds/Updates_Tables.docx
@@ -90,10 +90,10 @@
     <w:p>
       <w:r>
         <w:drawing>
-          <wp:inline distT="0" distB="0" distL="0" distR="0" wp14:anchorId="1CD5CC5D" wp14:editId="4FE9A338">
-            <wp:extent cx="5943600" cy="5657850"/>
+          <wp:inline distT="0" distB="0" distL="0" distR="0" wp14:anchorId="380168B2" wp14:editId="1C2AB254">
+            <wp:extent cx="5943600" cy="5949950"/>
             <wp:effectExtent l="0" t="0" r="0" b="6350"/>
-            <wp:docPr id="1591711171" name="Picture 1"/>
+            <wp:docPr id="873970158" name="Picture 1"/>
             <wp:cNvGraphicFramePr>
               <a:graphicFrameLocks xmlns:a="http://schemas.openxmlformats.org/drawingml/2006/main" noChangeAspect="1"/>
             </wp:cNvGraphicFramePr>
@@ -101,7 +101,7 @@
               <a:graphicData uri="http://schemas.openxmlformats.org/drawingml/2006/picture">
                 <pic:pic xmlns:pic="http://schemas.openxmlformats.org/drawingml/2006/picture">
                   <pic:nvPicPr>
-                    <pic:cNvPr id="1591711171" name=""/>
+                    <pic:cNvPr id="873970158" name=""/>
                     <pic:cNvPicPr/>
                   </pic:nvPicPr>
                   <pic:blipFill>
@@ -113,7 +113,7 @@
                   <pic:spPr>
                     <a:xfrm>
                       <a:off x="0" y="0"/>
-                      <a:ext cx="5943600" cy="5657850"/>
+                      <a:ext cx="5943600" cy="5949950"/>
                     </a:xfrm>
                     <a:prstGeom prst="rect">
                       <a:avLst/>

</xml_diff>